<commit_message>
Finalize submission bundle and verify public deployment
</commit_message>
<xml_diff>
--- a/docs/report.docx
+++ b/docs/report.docx
@@ -2192,7 +2192,7 @@
           <w:sz w:val="28"/>
           <w:szCs w:val="28"/>
         </w:rPr>
-        <w:t xml:space="preserve">Середовище: Playwright Chromium (local Microsoft Edge when available). Успішних браузерних перевірок: 24; помилок JavaScript: 0. Модульні перевірки виконуються окремо командою npm test. Нижче наведено сценарії з фактичного протоколу.</w:t>
+        <w:t xml:space="preserve">Середовище: Playwright Chromium (local Microsoft Edge when available). Успішних браузерних перевірок: 25; помилок JavaScript: 0. Модульні перевірки виконуються окремо командою npm test. Нижче наведено сценарії з фактичного протоколу.</w:t>
       </w:r>
     </w:p>
     <w:p>
@@ -2221,6 +2221,20 @@
           <w:szCs w:val="28"/>
         </w:rPr>
         <w:t xml:space="preserve">✓ Default indicators are temperature and precipitation</w:t>
+      </w:r>
+    </w:p>
+    <w:p>
+      <w:pPr>
+        <w:spacing w:after="160" w:line="360"/>
+        <w:jc w:val="both"/>
+      </w:pPr>
+      <w:r>
+        <w:rPr>
+          <w:rFonts w:ascii="Times New Roman" w:cs="Times New Roman" w:eastAsia="Times New Roman" w:hAnsi="Times New Roman"/>
+          <w:sz w:val="28"/>
+          <w:szCs w:val="28"/>
+        </w:rPr>
+        <w:t xml:space="preserve">✓ Changing settings cancels pending audio startup</w:t>
       </w:r>
     </w:p>
     <w:p>

</xml_diff>

<commit_message>
Publish verified SONORA static application
</commit_message>
<xml_diff>
--- a/docs/report.docx
+++ b/docs/report.docx
@@ -2192,7 +2192,7 @@
           <w:sz w:val="28"/>
           <w:szCs w:val="28"/>
         </w:rPr>
-        <w:t xml:space="preserve">Середовище: Playwright Chromium (local Microsoft Edge when available). Успішних браузерних перевірок: 24; помилок JavaScript: 0. Модульні перевірки виконуються окремо командою npm test. Нижче наведено сценарії з фактичного протоколу.</w:t>
+        <w:t xml:space="preserve">Середовище: Playwright Chromium (local Microsoft Edge when available). Успішних браузерних перевірок: 25; помилок JavaScript: 0. Модульні перевірки виконуються окремо командою npm test. Нижче наведено сценарії з фактичного протоколу.</w:t>
       </w:r>
     </w:p>
     <w:p>
@@ -2221,6 +2221,20 @@
           <w:szCs w:val="28"/>
         </w:rPr>
         <w:t xml:space="preserve">✓ Default indicators are temperature and precipitation</w:t>
+      </w:r>
+    </w:p>
+    <w:p>
+      <w:pPr>
+        <w:spacing w:after="160" w:line="360"/>
+        <w:jc w:val="both"/>
+      </w:pPr>
+      <w:r>
+        <w:rPr>
+          <w:rFonts w:ascii="Times New Roman" w:cs="Times New Roman" w:eastAsia="Times New Roman" w:hAnsi="Times New Roman"/>
+          <w:sz w:val="28"/>
+          <w:szCs w:val="28"/>
+        </w:rPr>
+        <w:t xml:space="preserve">✓ Changing settings cancels pending audio startup</w:t>
       </w:r>
     </w:p>
     <w:p>

</xml_diff>